<commit_message>
Added warning remarks to the release noptes
</commit_message>
<xml_diff>
--- a/Documentation/Official Documentation/Release Notes/Release Notes for IBOS MusicXmlReader version 5.0.0.0.docx
+++ b/Documentation/Official Documentation/Release Notes/Release Notes for IBOS MusicXmlReader version 5.0.0.0.docx
@@ -35,7 +35,11 @@
         </w:rPr>
       </w:pPr>
       <w:r>
-        <w:rPr/>
+        <w:rPr>
+          <w:rFonts w:cs="Arial" w:ascii="Arial" w:hAnsi="Arial"/>
+          <w:b/>
+          <w:color w:val="000000"/>
+        </w:rPr>
       </w:r>
     </w:p>
     <w:p>
@@ -56,23 +60,7 @@
           <w:b/>
           <w:color w:val="000000"/>
         </w:rPr>
-        <w:t xml:space="preserve">Corrections and additions with respect to IBOS MusicXmlReader version </w:t>
-      </w:r>
-      <w:r>
-        <w:rPr>
-          <w:rFonts w:cs="Arial" w:ascii="Arial" w:hAnsi="Arial"/>
-          <w:b/>
-          <w:color w:val="000000"/>
-        </w:rPr>
-        <w:t>4</w:t>
-      </w:r>
-      <w:r>
-        <w:rPr>
-          <w:rFonts w:cs="Arial" w:ascii="Arial" w:hAnsi="Arial"/>
-          <w:b/>
-          <w:color w:val="000000"/>
-        </w:rPr>
-        <w:t>.0.0.0</w:t>
+        <w:t>Corrections and additions with respect to IBOS MusicXmlReader version 4.0.0.0</w:t>
       </w:r>
     </w:p>
     <w:p>
@@ -151,135 +139,31 @@
           <w:bCs w:val="false"/>
           <w:color w:val="000000"/>
         </w:rPr>
-        <w:t>A completely new integrated tool</w:t>
-      </w:r>
-      <w:r>
-        <w:rPr>
-          <w:b w:val="false"/>
-          <w:bCs w:val="false"/>
-          <w:color w:val="000000"/>
-        </w:rPr>
-        <w:t xml:space="preserve"> ”IBOS</w:t>
-      </w:r>
-      <w:r>
-        <w:rPr>
-          <w:b w:val="false"/>
-          <w:bCs w:val="false"/>
-          <w:color w:val="000000"/>
-        </w:rPr>
-        <w:t xml:space="preserve"> </w:t>
-      </w:r>
-      <w:r>
-        <w:rPr>
-          <w:b w:val="false"/>
-          <w:bCs w:val="false"/>
-          <w:color w:val="000000"/>
-        </w:rPr>
-        <w:t xml:space="preserve">Music Braille </w:t>
-      </w:r>
-      <w:r>
-        <w:rPr>
-          <w:b w:val="false"/>
-          <w:bCs w:val="false"/>
-          <w:color w:val="000000"/>
-        </w:rPr>
-        <w:t>Reader</w:t>
-      </w:r>
-      <w:r>
-        <w:rPr>
-          <w:b w:val="false"/>
-          <w:bCs w:val="false"/>
-          <w:color w:val="000000"/>
-        </w:rPr>
-        <w:t xml:space="preserve">” </w:t>
-      </w:r>
-      <w:r>
-        <w:rPr>
-          <w:b w:val="false"/>
-          <w:bCs w:val="false"/>
-          <w:color w:val="000000"/>
-        </w:rPr>
-        <w:t xml:space="preserve">now supports </w:t>
-      </w:r>
-      <w:r>
-        <w:rPr>
-          <w:b w:val="false"/>
-          <w:bCs w:val="false"/>
-          <w:color w:val="000000"/>
-        </w:rPr>
-        <w:t xml:space="preserve">reading and </w:t>
-      </w:r>
-      <w:r>
-        <w:rPr>
-          <w:b w:val="false"/>
-          <w:bCs w:val="false"/>
-          <w:color w:val="000000"/>
-        </w:rPr>
-        <w:t>interpretation of existing Music Braille files, for instance</w:t>
-      </w:r>
-      <w:r>
-        <w:rPr>
-          <w:b w:val="false"/>
-          <w:bCs w:val="false"/>
-          <w:color w:val="000000"/>
-        </w:rPr>
-        <w:t xml:space="preserve"> genereret </w:t>
-      </w:r>
-      <w:r>
-        <w:rPr>
-          <w:b w:val="false"/>
-          <w:bCs w:val="false"/>
-          <w:color w:val="000000"/>
-        </w:rPr>
-        <w:t>by</w:t>
-      </w:r>
-      <w:r>
-        <w:rPr>
-          <w:b w:val="false"/>
-          <w:bCs w:val="false"/>
-          <w:color w:val="000000"/>
-        </w:rPr>
-        <w:t xml:space="preserve"> </w:t>
-      </w:r>
-      <w:r>
-        <w:rPr>
-          <w:b w:val="false"/>
-          <w:bCs w:val="false"/>
-          <w:color w:val="000000"/>
-        </w:rPr>
-        <w:t xml:space="preserve">the Danish NOTA Institute or by the </w:t>
-      </w:r>
-      <w:r>
-        <w:rPr>
-          <w:b w:val="false"/>
-          <w:bCs w:val="false"/>
-          <w:color w:val="000000"/>
-        </w:rPr>
-        <w:t xml:space="preserve">”IBOS </w:t>
-      </w:r>
-      <w:r>
-        <w:rPr>
-          <w:b w:val="false"/>
-          <w:bCs w:val="false"/>
-          <w:color w:val="000000"/>
-        </w:rPr>
-        <w:t>MusicXml Reader</w:t>
-      </w:r>
-      <w:r>
-        <w:rPr>
-          <w:b w:val="false"/>
-          <w:bCs w:val="false"/>
-          <w:color w:val="000000"/>
-        </w:rPr>
-        <w:t xml:space="preserve">”. </w:t>
-      </w:r>
-      <w:r>
-        <w:rPr>
-          <w:b w:val="false"/>
-          <w:bCs w:val="false"/>
-          <w:color w:val="000000"/>
-        </w:rPr>
-        <w:t xml:space="preserve">The Music Braille files are translated to a simple text representation, which is shown in a listbox and read by JAWS. </w:t>
+        <w:t xml:space="preserve">A completely new integrated tool ”IBOS Music Braille Reader” now supports reading and interpretation of existing Music Braille files, for instance genereret by the Danish NOTA Institute or by the ”IBOS MusicXml Reader”. The Music Braille files are translated to a simple text representation, which is shown in a listbox, </w:t>
+      </w:r>
+      <w:r>
+        <w:rPr>
+          <w:b w:val="false"/>
+          <w:bCs w:val="false"/>
+          <w:color w:val="000000"/>
+        </w:rPr>
+        <w:t>played as single notes</w:t>
+      </w:r>
+      <w:r>
+        <w:rPr>
+          <w:b w:val="false"/>
+          <w:bCs w:val="false"/>
+          <w:color w:val="000000"/>
+        </w:rPr>
+        <w:t xml:space="preserve"> and read by JAWS. </w:t>
+      </w:r>
+      <w:r>
+        <w:rPr>
+          <w:b w:val="false"/>
+          <w:bCs w:val="false"/>
+          <w:color w:val="000000"/>
+        </w:rPr>
+        <w:t>Please note that this new tool has not yet been through a thoroug enduser test and can not be expected to work correctly with all Music Braille files!</w:t>
       </w:r>
     </w:p>
     <w:p>
@@ -345,7 +229,11 @@
         </w:rPr>
       </w:pPr>
       <w:r>
-        <w:rPr/>
+        <w:rPr>
+          <w:b w:val="false"/>
+          <w:bCs w:val="false"/>
+          <w:color w:val="000000"/>
+        </w:rPr>
       </w:r>
     </w:p>
     <w:p>
@@ -410,31 +298,7 @@
           <w:bCs w:val="false"/>
           <w:color w:val="000000"/>
         </w:rPr>
-        <w:t xml:space="preserve">A new profile ”Highspeed Embosser” has ben added. This profile as default contains the settings for </w:t>
-      </w:r>
-      <w:r>
-        <w:rPr>
-          <w:b w:val="false"/>
-          <w:bCs w:val="false"/>
-          <w:color w:val="000000"/>
-        </w:rPr>
-        <w:t xml:space="preserve">the setup of the ”Braille 650 SF” highspeed embosser used by the Danish ”NOTA” Institute. This profile can, </w:t>
-      </w:r>
-      <w:r>
-        <w:rPr>
-          <w:b w:val="false"/>
-          <w:bCs w:val="false"/>
-          <w:color w:val="000000"/>
-        </w:rPr>
-        <w:t>however,</w:t>
-      </w:r>
-      <w:r>
-        <w:rPr>
-          <w:b w:val="false"/>
-          <w:bCs w:val="false"/>
-          <w:color w:val="000000"/>
-        </w:rPr>
-        <w:t xml:space="preserve"> easily be modified by the user if required.</w:t>
+        <w:t>A new profile ”Highspeed Embosser” has ben added. This profile as default contains the settings for the setup of the ”Braille 650 SF” highspeed embosser used by the Danish ”NOTA” Institute. This profile can, however, easily be modified by the user if required.</w:t>
       </w:r>
     </w:p>
     <w:p>
@@ -524,23 +388,7 @@
           <w:bCs w:val="false"/>
           <w:color w:val="000000"/>
         </w:rPr>
-        <w:t xml:space="preserve">Support while generating Music Braille </w:t>
-      </w:r>
-      <w:r>
-        <w:rPr>
-          <w:b w:val="false"/>
-          <w:bCs w:val="false"/>
-          <w:color w:val="000000"/>
-        </w:rPr>
-        <w:t xml:space="preserve">symbols </w:t>
-      </w:r>
-      <w:r>
-        <w:rPr>
-          <w:b w:val="false"/>
-          <w:bCs w:val="false"/>
-          <w:color w:val="000000"/>
-        </w:rPr>
-        <w:t>for ”dynamics”, that is ”</w:t>
+        <w:t>Support while generating Music Braille symbols for ”dynamics”, that is ”</w:t>
       </w:r>
       <w:r>
         <w:rPr>
@@ -598,23 +446,7 @@
           <w:bCs w:val="false"/>
           <w:color w:val="000000"/>
         </w:rPr>
-        <w:t xml:space="preserve">Support while generating Music Braille </w:t>
-      </w:r>
-      <w:r>
-        <w:rPr>
-          <w:b w:val="false"/>
-          <w:bCs w:val="false"/>
-          <w:color w:val="000000"/>
-        </w:rPr>
-        <w:t xml:space="preserve">symbols </w:t>
-      </w:r>
-      <w:r>
-        <w:rPr>
-          <w:b w:val="false"/>
-          <w:bCs w:val="false"/>
-          <w:color w:val="000000"/>
-        </w:rPr>
-        <w:t>for ”wedges”, describing crescendo and diminuendo.</w:t>
+        <w:t>Support while generating Music Braille symbols for ”wedges”, describing crescendo and diminuendo.</w:t>
       </w:r>
     </w:p>
     <w:p>
@@ -635,9 +467,8 @@
       </w:pPr>
       <w:r>
         <w:rPr>
-          <w:b w:val="false"/>
-          <w:bCs w:val="false"/>
-          <w:color w:val="000000"/>
+          <w:rFonts w:cs="Arial" w:ascii="Arial" w:hAnsi="Arial"/>
+          <w:b/>
         </w:rPr>
       </w:r>
     </w:p>
@@ -659,9 +490,8 @@
       </w:pPr>
       <w:r>
         <w:rPr>
-          <w:b w:val="false"/>
-          <w:bCs w:val="false"/>
-          <w:color w:val="000000"/>
+          <w:rFonts w:cs="Arial" w:ascii="Arial" w:hAnsi="Arial"/>
+          <w:b/>
         </w:rPr>
       </w:r>
     </w:p>
@@ -680,21 +510,7 @@
           <w:rFonts w:cs="Arial" w:ascii="Arial" w:hAnsi="Arial"/>
           <w:b/>
         </w:rPr>
-        <w:t xml:space="preserve">Corrections and additions with respect to IBOS MusicXmlReader version </w:t>
-      </w:r>
-      <w:r>
-        <w:rPr>
-          <w:rFonts w:cs="Arial" w:ascii="Arial" w:hAnsi="Arial"/>
-          <w:b/>
-        </w:rPr>
-        <w:t>4</w:t>
-      </w:r>
-      <w:r>
-        <w:rPr>
-          <w:rFonts w:cs="Arial" w:ascii="Arial" w:hAnsi="Arial"/>
-          <w:b/>
-        </w:rPr>
-        <w:t>.0.0.0</w:t>
+        <w:t>Corrections and additions with respect to IBOS MusicXmlReader version 4.0.0.0</w:t>
       </w:r>
     </w:p>
     <w:p>
@@ -715,21 +531,7 @@
           <w:rFonts w:cs="Arial" w:ascii="Arial" w:hAnsi="Arial"/>
           <w:bCs/>
         </w:rPr>
-        <w:t>The read</w:t>
-      </w:r>
-      <w:r>
-        <w:rPr>
-          <w:rFonts w:cs="Arial" w:ascii="Arial" w:hAnsi="Arial"/>
-          <w:bCs/>
-        </w:rPr>
-        <w:t>ing</w:t>
-      </w:r>
-      <w:r>
-        <w:rPr>
-          <w:rFonts w:cs="Arial" w:ascii="Arial" w:hAnsi="Arial"/>
-          <w:bCs/>
-        </w:rPr>
-        <w:t>-direction for interval notation is now “downwards for “Right Hand” as well as for the composite “SA” (Soprano + Alto) voice in SATB arrengements.</w:t>
+        <w:t>The reading-direction for interval notation is now “downwards for “Right Hand” as well as for the composite “SA” (Soprano + Alto) voice in SATB arrengements.</w:t>
       </w:r>
     </w:p>
     <w:p>
@@ -792,21 +594,28 @@
           <w:rFonts w:cs="Arial" w:ascii="Arial" w:hAnsi="Arial"/>
           <w:bCs/>
         </w:rPr>
-        <w:t>S</w:t>
-      </w:r>
+        <w:t>Spelling errors in Danish and Dutch versions have been fixed</w:t>
+      </w:r>
+    </w:p>
+    <w:p>
+      <w:pPr>
+        <w:pStyle w:val="Normal"/>
+        <w:numPr>
+          <w:ilvl w:val="0"/>
+          <w:numId w:val="1"/>
+        </w:numPr>
+        <w:spacing w:lineRule="auto" w:line="252"/>
+        <w:rPr/>
+      </w:pPr>
       <w:r>
         <w:rPr>
           <w:rFonts w:cs="Arial" w:ascii="Arial" w:hAnsi="Arial"/>
           <w:bCs/>
         </w:rPr>
-        <w:t xml:space="preserve">pelling errors in Danish and Dutch versions </w:t>
-      </w:r>
-      <w:r>
-        <w:rPr>
-          <w:rFonts w:cs="Arial" w:ascii="Arial" w:hAnsi="Arial"/>
-          <w:bCs/>
-        </w:rPr>
-        <w:t>have been fixed</w:t>
+        <w:t>Several other large or minor errors, reported by end users have been fixed.</w:t>
+      </w:r>
+      <w:r>
+        <w:br w:type="page"/>
       </w:r>
     </w:p>
     <w:p>
@@ -814,9 +623,10 @@
         <w:pStyle w:val="Normal"/>
         <w:numPr>
           <w:ilvl w:val="0"/>
-          <w:numId w:val="1"/>
+          <w:numId w:val="0"/>
         </w:numPr>
         <w:spacing w:lineRule="auto" w:line="252"/>
+        <w:ind w:left="785" w:hanging="0"/>
         <w:rPr>
           <w:rFonts w:ascii="Arial" w:hAnsi="Arial" w:cs="Arial"/>
           <w:bCs/>
@@ -827,152 +637,62 @@
           <w:rFonts w:cs="Arial" w:ascii="Arial" w:hAnsi="Arial"/>
           <w:bCs/>
         </w:rPr>
-        <w:t>S</w:t>
-      </w:r>
-      <w:r>
-        <w:rPr>
-          <w:rFonts w:cs="Arial" w:ascii="Arial" w:hAnsi="Arial"/>
-          <w:bCs/>
-        </w:rPr>
-        <w:t xml:space="preserve">everal other </w:t>
-      </w:r>
-      <w:r>
-        <w:rPr>
-          <w:rFonts w:cs="Arial" w:ascii="Arial" w:hAnsi="Arial"/>
-          <w:bCs/>
-        </w:rPr>
-        <w:t xml:space="preserve">large or minor </w:t>
-      </w:r>
-      <w:r>
-        <w:rPr>
-          <w:rFonts w:cs="Arial" w:ascii="Arial" w:hAnsi="Arial"/>
-          <w:bCs/>
-        </w:rPr>
-        <w:t xml:space="preserve">errors, reported by end users </w:t>
-      </w:r>
-      <w:r>
-        <w:rPr>
-          <w:rFonts w:cs="Arial" w:ascii="Arial" w:hAnsi="Arial"/>
-          <w:bCs/>
-        </w:rPr>
-        <w:t>have been fixed.</w:t>
       </w:r>
     </w:p>
     <w:p>
       <w:pPr>
         <w:pStyle w:val="Normal"/>
+        <w:numPr>
+          <w:ilvl w:val="0"/>
+          <w:numId w:val="0"/>
+        </w:numPr>
+        <w:outlineLvl w:val="0"/>
+        <w:rPr/>
+      </w:pPr>
+      <w:r>
+        <w:rPr>
+          <w:rFonts w:cs="Arial" w:ascii="Arial" w:hAnsi="Arial"/>
+          <w:b/>
+        </w:rPr>
+        <w:t>Known defects in IBOS MusicXmlReader version 5.0.0.0</w:t>
+      </w:r>
+    </w:p>
+    <w:p>
+      <w:pPr>
+        <w:pStyle w:val="Normal"/>
+        <w:numPr>
+          <w:ilvl w:val="0"/>
+          <w:numId w:val="0"/>
+        </w:numPr>
+        <w:outlineLvl w:val="0"/>
+        <w:rPr>
+          <w:rFonts w:ascii="Arial" w:hAnsi="Arial" w:cs="Arial"/>
+          <w:b/>
+          <w:b/>
+        </w:rPr>
+      </w:pPr>
+      <w:r>
+        <w:rPr>
+          <w:rFonts w:cs="Arial" w:ascii="Arial" w:hAnsi="Arial"/>
+          <w:b/>
+        </w:rPr>
+      </w:r>
+    </w:p>
+    <w:p>
+      <w:pPr>
+        <w:pStyle w:val="Normal"/>
+        <w:numPr>
+          <w:ilvl w:val="0"/>
+          <w:numId w:val="3"/>
+        </w:numPr>
         <w:spacing w:lineRule="auto" w:line="252"/>
-        <w:rPr>
-          <w:rFonts w:ascii="Arial" w:hAnsi="Arial" w:cs="Arial"/>
-          <w:bCs/>
-        </w:rPr>
-      </w:pPr>
-      <w:r>
-        <w:rPr>
-          <w:rFonts w:cs="Arial" w:ascii="Arial" w:hAnsi="Arial"/>
-          <w:bCs/>
-        </w:rPr>
-      </w:r>
-      <w:r>
-        <w:br w:type="page"/>
-      </w:r>
-    </w:p>
-    <w:p>
-      <w:pPr>
-        <w:pStyle w:val="Normal"/>
-        <w:numPr>
-          <w:ilvl w:val="0"/>
-          <w:numId w:val="0"/>
-        </w:numPr>
-        <w:spacing w:lineRule="auto" w:line="252"/>
-        <w:ind w:left="785" w:hanging="0"/>
-        <w:rPr>
-          <w:rFonts w:ascii="Arial" w:hAnsi="Arial" w:cs="Arial"/>
-          <w:bCs/>
-        </w:rPr>
-      </w:pPr>
-      <w:r>
-        <w:rPr>
-          <w:rFonts w:cs="Arial" w:ascii="Arial" w:hAnsi="Arial"/>
-          <w:bCs/>
-        </w:rPr>
-      </w:r>
-    </w:p>
-    <w:p>
-      <w:pPr>
-        <w:pStyle w:val="Normal"/>
-        <w:numPr>
-          <w:ilvl w:val="0"/>
-          <w:numId w:val="0"/>
-        </w:numPr>
-        <w:outlineLvl w:val="0"/>
-        <w:rPr/>
-      </w:pPr>
-      <w:r>
-        <w:rPr>
-          <w:rFonts w:cs="Arial" w:ascii="Arial" w:hAnsi="Arial"/>
-          <w:b/>
-        </w:rPr>
-        <w:t>Known defects in IBOS MusicXmlReader version 5.0.0.0</w:t>
-      </w:r>
-    </w:p>
-    <w:p>
-      <w:pPr>
-        <w:pStyle w:val="Normal"/>
-        <w:numPr>
-          <w:ilvl w:val="0"/>
-          <w:numId w:val="0"/>
-        </w:numPr>
-        <w:outlineLvl w:val="0"/>
-        <w:rPr>
-          <w:rFonts w:ascii="Arial" w:hAnsi="Arial" w:cs="Arial"/>
-          <w:b/>
-          <w:b/>
-        </w:rPr>
-      </w:pPr>
-      <w:r>
-        <w:rPr/>
-      </w:r>
-    </w:p>
-    <w:p>
-      <w:pPr>
-        <w:pStyle w:val="Normal"/>
-        <w:numPr>
-          <w:ilvl w:val="0"/>
-          <w:numId w:val="3"/>
-        </w:numPr>
-        <w:spacing w:lineRule="auto" w:line="252"/>
-        <w:rPr/>
-      </w:pPr>
-      <w:r>
-        <w:rPr>
-          <w:rFonts w:cs="Arial" w:ascii="Arial" w:hAnsi="Arial"/>
-        </w:rPr>
-        <w:t xml:space="preserve">Only a </w:t>
-      </w:r>
-      <w:r>
-        <w:rPr>
-          <w:rFonts w:cs="Arial" w:ascii="Arial" w:hAnsi="Arial"/>
-        </w:rPr>
-        <w:t xml:space="preserve">(rether large, however) </w:t>
-      </w:r>
-      <w:r>
-        <w:rPr>
-          <w:rFonts w:cs="Arial" w:ascii="Arial" w:hAnsi="Arial"/>
-        </w:rPr>
-        <w:t>subset of the details in the MusicXml file</w:t>
-      </w:r>
-      <w:r>
-        <w:rPr>
-          <w:rFonts w:cs="Arial" w:ascii="Arial" w:hAnsi="Arial"/>
-        </w:rPr>
-        <w:t>s and Music Braille files are handled</w:t>
-      </w:r>
-      <w:r>
-        <w:rPr>
-          <w:rFonts w:cs="Arial" w:ascii="Arial" w:hAnsi="Arial"/>
-        </w:rPr>
-        <w:t>.</w:t>
+        <w:rPr/>
+      </w:pPr>
+      <w:r>
+        <w:rPr>
+          <w:rFonts w:cs="Arial" w:ascii="Arial" w:hAnsi="Arial"/>
+        </w:rPr>
+        <w:t>Only a (rether large, however) subset of the details in the MusicXml files and Music Braille files are handled.</w:t>
       </w:r>
     </w:p>
     <w:p>
@@ -1282,7 +1002,7 @@
         <w:ind w:left="720" w:hanging="360"/>
       </w:pPr>
       <w:rPr>
-        <w:rFonts w:ascii="Arial" w:hAnsi="Arial" w:cs="Arial"/>
+        <w:rFonts w:cs="Arial"/>
       </w:rPr>
     </w:lvl>
     <w:lvl w:ilvl="1">
@@ -1370,7 +1090,6 @@
         </w:tabs>
         <w:ind w:left="720" w:hanging="360"/>
       </w:pPr>
-      <w:rPr/>
     </w:lvl>
     <w:lvl w:ilvl="1">
       <w:start w:val="1"/>
@@ -1383,7 +1102,6 @@
         </w:tabs>
         <w:ind w:left="1080" w:hanging="360"/>
       </w:pPr>
-      <w:rPr/>
     </w:lvl>
     <w:lvl w:ilvl="2">
       <w:start w:val="1"/>
@@ -1396,7 +1114,6 @@
         </w:tabs>
         <w:ind w:left="1440" w:hanging="360"/>
       </w:pPr>
-      <w:rPr/>
     </w:lvl>
     <w:lvl w:ilvl="3">
       <w:start w:val="1"/>
@@ -1409,7 +1126,6 @@
         </w:tabs>
         <w:ind w:left="1800" w:hanging="360"/>
       </w:pPr>
-      <w:rPr/>
     </w:lvl>
     <w:lvl w:ilvl="4">
       <w:start w:val="1"/>
@@ -1422,7 +1138,6 @@
         </w:tabs>
         <w:ind w:left="2160" w:hanging="360"/>
       </w:pPr>
-      <w:rPr/>
     </w:lvl>
     <w:lvl w:ilvl="5">
       <w:start w:val="1"/>
@@ -1435,7 +1150,6 @@
         </w:tabs>
         <w:ind w:left="2520" w:hanging="360"/>
       </w:pPr>
-      <w:rPr/>
     </w:lvl>
     <w:lvl w:ilvl="6">
       <w:start w:val="1"/>
@@ -1448,7 +1162,6 @@
         </w:tabs>
         <w:ind w:left="2880" w:hanging="360"/>
       </w:pPr>
-      <w:rPr/>
     </w:lvl>
     <w:lvl w:ilvl="7">
       <w:start w:val="1"/>
@@ -1461,7 +1174,6 @@
         </w:tabs>
         <w:ind w:left="3240" w:hanging="360"/>
       </w:pPr>
-      <w:rPr/>
     </w:lvl>
     <w:lvl w:ilvl="8">
       <w:start w:val="1"/>
@@ -1474,7 +1186,6 @@
         </w:tabs>
         <w:ind w:left="3600" w:hanging="360"/>
       </w:pPr>
-      <w:rPr/>
     </w:lvl>
   </w:abstractNum>
   <w:abstractNum w:abstractNumId="4">
@@ -1590,13 +1301,16 @@
     <w:rPrDefault>
       <w:rPr>
         <w:rFonts w:ascii="Liberation Serif" w:hAnsi="Liberation Serif" w:eastAsia="NSimSun" w:cs="Lucida Sans"/>
+        <w:kern w:val="2"/>
         <w:sz w:val="24"/>
         <w:szCs w:val="24"/>
         <w:lang w:val="da-DK" w:eastAsia="zh-CN" w:bidi="hi-IN"/>
       </w:rPr>
     </w:rPrDefault>
     <w:pPrDefault>
-      <w:pPr/>
+      <w:pPr>
+        <w:widowControl/>
+      </w:pPr>
     </w:pPrDefault>
   </w:docDefaults>
   <w:style w:type="paragraph" w:styleId="Normal">
@@ -1604,6 +1318,9 @@
     <w:qFormat/>
     <w:pPr>
       <w:widowControl/>
+      <w:kinsoku w:val="true"/>
+      <w:overflowPunct w:val="true"/>
+      <w:autoSpaceDE w:val="true"/>
       <w:bidi w:val="0"/>
       <w:spacing w:lineRule="auto" w:line="252" w:before="0" w:after="160"/>
       <w:jc w:val="left"/>
@@ -1865,6 +1582,36 @@
     <w:qFormat/>
     <w:rPr/>
   </w:style>
+  <w:style w:type="character" w:styleId="WW8Num2z8">
+    <w:name w:val="WW8Num2z8"/>
+    <w:qFormat/>
+    <w:rPr/>
+  </w:style>
+  <w:style w:type="character" w:styleId="WW8Num2z7">
+    <w:name w:val="WW8Num2z7"/>
+    <w:qFormat/>
+    <w:rPr/>
+  </w:style>
+  <w:style w:type="character" w:styleId="WW8Num2z6">
+    <w:name w:val="WW8Num2z6"/>
+    <w:qFormat/>
+    <w:rPr/>
+  </w:style>
+  <w:style w:type="character" w:styleId="WW8Num2z5">
+    <w:name w:val="WW8Num2z5"/>
+    <w:qFormat/>
+    <w:rPr/>
+  </w:style>
+  <w:style w:type="character" w:styleId="WW8Num2z4">
+    <w:name w:val="WW8Num2z4"/>
+    <w:qFormat/>
+    <w:rPr/>
+  </w:style>
+  <w:style w:type="character" w:styleId="WW8Num2z3">
+    <w:name w:val="WW8Num2z3"/>
+    <w:qFormat/>
+    <w:rPr/>
+  </w:style>
   <w:style w:type="paragraph" w:styleId="Overskrift">
     <w:name w:val="Overskrift"/>
     <w:basedOn w:val="Normal"/>
@@ -1941,7 +1688,7 @@
     <w:pPr>
       <w:suppressLineNumbers/>
       <w:tabs>
-        <w:tab w:val="clear" w:pos="720"/>
+        <w:tab w:val="clear" w:pos="709"/>
         <w:tab w:val="center" w:pos="4819" w:leader="none"/>
         <w:tab w:val="right" w:pos="9638" w:leader="none"/>
       </w:tabs>
@@ -1953,7 +1700,7 @@
     <w:basedOn w:val="Normal"/>
     <w:pPr>
       <w:tabs>
-        <w:tab w:val="clear" w:pos="720"/>
+        <w:tab w:val="clear" w:pos="709"/>
         <w:tab w:val="center" w:pos="4819" w:leader="none"/>
         <w:tab w:val="right" w:pos="9638" w:leader="none"/>
       </w:tabs>
@@ -1965,7 +1712,7 @@
     <w:basedOn w:val="Normal"/>
     <w:pPr>
       <w:tabs>
-        <w:tab w:val="clear" w:pos="720"/>
+        <w:tab w:val="clear" w:pos="709"/>
         <w:tab w:val="center" w:pos="4819" w:leader="none"/>
         <w:tab w:val="right" w:pos="9638" w:leader="none"/>
       </w:tabs>
@@ -2098,7 +1845,7 @@
     <w:qFormat/>
     <w:pPr>
       <w:tabs>
-        <w:tab w:val="clear" w:pos="720"/>
+        <w:tab w:val="clear" w:pos="709"/>
         <w:tab w:val="left" w:pos="0" w:leader="none"/>
         <w:tab w:val="left" w:pos="959" w:leader="none"/>
         <w:tab w:val="left" w:pos="1918" w:leader="none"/>
@@ -2126,6 +1873,9 @@
       <w:pBdr>
         <w:top w:val="double" w:sz="2" w:space="0" w:color="000000"/>
       </w:pBdr>
+      <w:kinsoku w:val="true"/>
+      <w:overflowPunct w:val="true"/>
+      <w:autoSpaceDE w:val="true"/>
       <w:bidi w:val="0"/>
       <w:jc w:val="center"/>
     </w:pPr>
@@ -2147,6 +1897,9 @@
       <w:pBdr>
         <w:bottom w:val="double" w:sz="2" w:space="0" w:color="000000"/>
       </w:pBdr>
+      <w:kinsoku w:val="true"/>
+      <w:overflowPunct w:val="true"/>
+      <w:autoSpaceDE w:val="true"/>
       <w:bidi w:val="0"/>
       <w:jc w:val="center"/>
     </w:pPr>
@@ -2166,6 +1919,9 @@
     <w:pPr>
       <w:widowControl w:val="false"/>
       <w:suppressAutoHyphens w:val="true"/>
+      <w:kinsoku w:val="true"/>
+      <w:overflowPunct w:val="true"/>
+      <w:autoSpaceDE w:val="true"/>
       <w:bidi w:val="0"/>
       <w:jc w:val="left"/>
       <w:textAlignment w:val="baseline"/>
@@ -2179,6 +1935,27 @@
       <w:lang w:val="da-DK" w:eastAsia="zh-CN" w:bidi="da-DK"/>
     </w:rPr>
   </w:style>
+  <w:style w:type="paragraph" w:styleId="Listeafsnit">
+    <w:name w:val="Listeafsnit"/>
+    <w:basedOn w:val="Normal"/>
+    <w:qFormat/>
+    <w:pPr>
+      <w:ind w:left="1304" w:right="0" w:hanging="0"/>
+    </w:pPr>
+    <w:rPr>
+      <w:rFonts w:cs="Mangal"/>
+      <w:szCs w:val="21"/>
+    </w:rPr>
+  </w:style>
+  <w:style w:type="paragraph" w:styleId="Textbody">
+    <w:name w:val="Text body"/>
+    <w:basedOn w:val="Standard"/>
+    <w:qFormat/>
+    <w:pPr>
+      <w:spacing w:before="0" w:after="120"/>
+    </w:pPr>
+    <w:rPr/>
+  </w:style>
   <w:style w:type="numbering" w:styleId="WW8Num1">
     <w:name w:val="WW8Num1"/>
     <w:qFormat/>
@@ -2195,5 +1972,9 @@
     <w:name w:val="WW8Num4"/>
     <w:qFormat/>
   </w:style>
+  <w:style w:type="numbering" w:styleId="Nummerering123">
+    <w:name w:val="Nummerering 123"/>
+    <w:qFormat/>
+  </w:style>
 </w:styles>
 </file>
</xml_diff>